<commit_message>
Simplify default XAMPP installation and update guide
</commit_message>
<xml_diff>
--- a/docs/word/Implementation-and-Management-2026.docx
+++ b/docs/word/Implementation-and-Management-2026.docx
@@ -725,7 +725,7 @@
     </w:p>
     <w:p>
       <w:r>
-        <w:t xml:space="preserve">These steps apply to a default Windows XAMPP installation with PHP 8.2 or newer and MariaDB/MySQL running on port 3306. The marker should use a fresh project copy and a test database. Do not overwrite an existing </w:t>
+        <w:t xml:space="preserve">These steps apply to a default Windows XAMPP installation with PHP 8.2 or newer. Use a fresh project copy and avoid overwriting an existing </w:t>
       </w:r>
       <w:r>
         <w:rPr>
@@ -735,7 +735,7 @@
         <w:t>htdocs\cafe</w:t>
       </w:r>
       <w:r>
-        <w:t xml:space="preserve"> folder belonging to another site.</w:t>
+        <w:t xml:space="preserve"> site.</w:t>
       </w:r>
     </w:p>
     <w:p>
@@ -747,7 +747,29 @@
         <w:t xml:space="preserve">1. </w:t>
       </w:r>
       <w:r>
-        <w:t xml:space="preserve">Copy the whole project folder to </w:t>
+        <w:t>Start Apache and MySQL in the XAMPP Control Panel.</w:t>
+      </w:r>
+    </w:p>
+    <w:p>
+      <w:pPr>
+        <w:spacing w:after="60"/>
+        <w:ind w:left="403" w:hanging="288"/>
+      </w:pPr>
+      <w:r>
+        <w:t xml:space="preserve">2. </w:t>
+      </w:r>
+      <w:r>
+        <w:t xml:space="preserve">Copy the whole project to </w:t>
+      </w:r>
+      <w:r>
+        <w:rPr>
+          <w:rFonts w:ascii="Consolas" w:hAnsi="Consolas"/>
+          <w:sz w:val="18"/>
+        </w:rPr>
+        <w:t>D:\XAMPP\htdocs\cafe</w:t>
+      </w:r>
+      <w:r>
+        <w:t xml:space="preserve"> on this computer (or </w:t>
       </w:r>
       <w:r>
         <w:rPr>
@@ -757,7 +779,17 @@
         <w:t>C:\xampp\htdocs\cafe</w:t>
       </w:r>
       <w:r>
-        <w:t xml:space="preserve"> or the equivalent folder under the installed XAMPP directory. Keep the </w:t>
+        <w:t xml:space="preserve"> if XAMPP is installed there). Check that </w:t>
+      </w:r>
+      <w:r>
+        <w:rPr>
+          <w:rFonts w:ascii="Consolas" w:hAnsi="Consolas"/>
+          <w:sz w:val="18"/>
+        </w:rPr>
+        <w:t>public\index.php</w:t>
+      </w:r>
+      <w:r>
+        <w:t xml:space="preserve"> exists inside the copied folder and keep the </w:t>
       </w:r>
       <w:r>
         <w:rPr>
@@ -797,39 +829,7 @@
         <w:t>public</w:t>
       </w:r>
       <w:r>
-        <w:t xml:space="preserve"> folders together, including both </w:t>
-      </w:r>
-      <w:r>
-        <w:rPr>
-          <w:rFonts w:ascii="Consolas" w:hAnsi="Consolas"/>
-          <w:sz w:val="18"/>
-        </w:rPr>
-        <w:t>.htaccess</w:t>
-      </w:r>
-      <w:r>
-        <w:t xml:space="preserve"> files.</w:t>
-      </w:r>
-    </w:p>
-    <w:p>
-      <w:pPr>
-        <w:spacing w:after="60"/>
-        <w:ind w:left="403" w:hanging="288"/>
-      </w:pPr>
-      <w:r>
-        <w:t xml:space="preserve">2. </w:t>
-      </w:r>
-      <w:r>
-        <w:t xml:space="preserve">In the XAMPP Control Panel, start Apache and MySQL. Open </w:t>
-      </w:r>
-      <w:r>
-        <w:rPr>
-          <w:rFonts w:ascii="Consolas" w:hAnsi="Consolas"/>
-          <w:sz w:val="18"/>
-        </w:rPr>
-        <w:t>http://localhost/phpmyadmin/</w:t>
-      </w:r>
-      <w:r>
-        <w:t>.</w:t>
+        <w:t xml:space="preserve"> folders together.</w:t>
       </w:r>
     </w:p>
     <w:p>
@@ -841,7 +841,17 @@
         <w:t xml:space="preserve">3. </w:t>
       </w:r>
       <w:r>
-        <w:t xml:space="preserve">Import </w:t>
+        <w:t xml:space="preserve">Open </w:t>
+      </w:r>
+      <w:r>
+        <w:rPr>
+          <w:rFonts w:ascii="Consolas" w:hAnsi="Consolas"/>
+          <w:sz w:val="18"/>
+        </w:rPr>
+        <w:t>http://localhost/phpmyadmin/</w:t>
+      </w:r>
+      <w:r>
+        <w:t xml:space="preserve">. In its Import tab, choose </w:t>
       </w:r>
       <w:r>
         <w:rPr>
@@ -851,7 +861,7 @@
         <w:t>database/xampp/01-create-database.sql</w:t>
       </w:r>
       <w:r>
-        <w:t xml:space="preserve">, then </w:t>
+        <w:t xml:space="preserve"> and click Import. Repeat for </w:t>
       </w:r>
       <w:r>
         <w:rPr>
@@ -861,7 +871,7 @@
         <w:t>02-create-tables.sql</w:t>
       </w:r>
       <w:r>
-        <w:t xml:space="preserve">, then </w:t>
+        <w:t xml:space="preserve"> and </w:t>
       </w:r>
       <w:r>
         <w:rPr>
@@ -871,7 +881,7 @@
         <w:t>03-demo-data.sql</w:t>
       </w:r>
       <w:r>
-        <w:t>. Import one file at a time from phpMyAdmin's Import tab. The third file adds 12 menu products and the demo staff account. Re-importing does not delete orders.</w:t>
+        <w:t>, in order. The third file adds 12 menu products and the demo staff account; re-importing does not delete orders.</w:t>
       </w:r>
     </w:p>
     <w:p>
@@ -883,7 +893,92 @@
         <w:t xml:space="preserve">4. </w:t>
       </w:r>
       <w:r>
-        <w:t xml:space="preserve">Copy </w:t>
+        <w:t xml:space="preserve">Open </w:t>
+      </w:r>
+      <w:r>
+        <w:rPr>
+          <w:rFonts w:ascii="Consolas" w:hAnsi="Consolas"/>
+          <w:sz w:val="18"/>
+        </w:rPr>
+        <w:t>http://localhost/cafe/public/</w:t>
+      </w:r>
+      <w:r>
+        <w:t xml:space="preserve">. Check the menu, register a customer, then sign in to the Staff desk using </w:t>
+      </w:r>
+      <w:r>
+        <w:rPr>
+          <w:rFonts w:ascii="Consolas" w:hAnsi="Consolas"/>
+          <w:sz w:val="18"/>
+        </w:rPr>
+        <w:t>staff@example.test</w:t>
+      </w:r>
+      <w:r>
+        <w:t xml:space="preserve"> and password </w:t>
+      </w:r>
+      <w:r>
+        <w:rPr>
+          <w:rFonts w:ascii="Consolas" w:hAnsi="Consolas"/>
+          <w:sz w:val="18"/>
+        </w:rPr>
+        <w:t>1234567890</w:t>
+      </w:r>
+      <w:r>
+        <w:t xml:space="preserve">. Check that browser requests to </w:t>
+      </w:r>
+      <w:r>
+        <w:rPr>
+          <w:rFonts w:ascii="Consolas" w:hAnsi="Consolas"/>
+          <w:sz w:val="18"/>
+        </w:rPr>
+        <w:t>app/</w:t>
+      </w:r>
+      <w:r>
+        <w:t xml:space="preserve"> and </w:t>
+      </w:r>
+      <w:r>
+        <w:rPr>
+          <w:rFonts w:ascii="Consolas" w:hAnsi="Consolas"/>
+          <w:sz w:val="18"/>
+        </w:rPr>
+        <w:t>config/</w:t>
+      </w:r>
+      <w:r>
+        <w:t xml:space="preserve"> are denied by the project-root </w:t>
+      </w:r>
+      <w:r>
+        <w:rPr>
+          <w:rFonts w:ascii="Consolas" w:hAnsi="Consolas"/>
+          <w:sz w:val="18"/>
+        </w:rPr>
+        <w:t>.htaccess</w:t>
+      </w:r>
+      <w:r>
+        <w:t>.</w:t>
+      </w:r>
+    </w:p>
+    <w:p>
+      <w:r>
+        <w:t xml:space="preserve">No configuration file is needed for standard XAMPP: local requests automatically use MySQL </w:t>
+      </w:r>
+      <w:r>
+        <w:rPr>
+          <w:rFonts w:ascii="Consolas" w:hAnsi="Consolas"/>
+          <w:sz w:val="18"/>
+        </w:rPr>
+        <w:t>root</w:t>
+      </w:r>
+      <w:r>
+        <w:t xml:space="preserve"> with a blank password on port </w:t>
+      </w:r>
+      <w:r>
+        <w:rPr>
+          <w:rFonts w:ascii="Consolas" w:hAnsi="Consolas"/>
+          <w:sz w:val="18"/>
+        </w:rPr>
+        <w:t>3306</w:t>
+      </w:r>
+      <w:r>
+        <w:t xml:space="preserve">. If XAMPP's MySQL has a custom root password or port, copy </w:t>
       </w:r>
       <w:r>
         <w:rPr>
@@ -903,69 +998,27 @@
         <w:t>config/local.php</w:t>
       </w:r>
       <w:r>
-        <w:t xml:space="preserve">. The template uses XAMPP's default local MySQL </w:t>
+        <w:t xml:space="preserve"> and edit </w:t>
       </w:r>
       <w:r>
         <w:rPr>
           <w:rFonts w:ascii="Consolas" w:hAnsi="Consolas"/>
           <w:sz w:val="18"/>
         </w:rPr>
-        <w:t>root</w:t>
+        <w:t>db_password</w:t>
       </w:r>
       <w:r>
-        <w:t xml:space="preserve"> account with a blank password. Edit the password or port if the XAMPP installation differs. Keep </w:t>
+        <w:t xml:space="preserve"> or </w:t>
       </w:r>
       <w:r>
         <w:rPr>
           <w:rFonts w:ascii="Consolas" w:hAnsi="Consolas"/>
           <w:sz w:val="18"/>
         </w:rPr>
-        <w:t>local.php</w:t>
+        <w:t>db_port</w:t>
       </w:r>
       <w:r>
-        <w:t xml:space="preserve"> out of version control.</w:t>
-      </w:r>
-    </w:p>
-    <w:p>
-      <w:pPr>
-        <w:spacing w:after="60"/>
-        <w:ind w:left="403" w:hanging="288"/>
-      </w:pPr>
-      <w:r>
-        <w:t xml:space="preserve">5. </w:t>
-      </w:r>
-      <w:r>
-        <w:t xml:space="preserve">Visit </w:t>
-      </w:r>
-      <w:r>
-        <w:rPr>
-          <w:rFonts w:ascii="Consolas" w:hAnsi="Consolas"/>
-          <w:sz w:val="18"/>
-        </w:rPr>
-        <w:t>http://localhost/cafe/public/</w:t>
-      </w:r>
-      <w:r>
-        <w:t xml:space="preserve">. Check that the home page and menu load. Register a customer, then sign out and sign in with the demo staff account to check the Staff desk. The project-root Apache rule must deny browser requests to </w:t>
-      </w:r>
-      <w:r>
-        <w:rPr>
-          <w:rFonts w:ascii="Consolas" w:hAnsi="Consolas"/>
-          <w:sz w:val="18"/>
-        </w:rPr>
-        <w:t>app/</w:t>
-      </w:r>
-      <w:r>
-        <w:t xml:space="preserve">, </w:t>
-      </w:r>
-      <w:r>
-        <w:rPr>
-          <w:rFonts w:ascii="Consolas" w:hAnsi="Consolas"/>
-          <w:sz w:val="18"/>
-        </w:rPr>
-        <w:t>config/</w:t>
-      </w:r>
-      <w:r>
-        <w:t xml:space="preserve"> and the other source folders.</w:t>
+        <w:t>. This private file is ignored by Git. A public deployment needs its own restricted database account and security configuration.</w:t>
       </w:r>
     </w:p>
     <w:p>
@@ -980,7 +1033,7 @@
         <w:t>setup-xampp.cmd</w:t>
       </w:r>
       <w:r>
-        <w:t xml:space="preserve">, keep that link and the existing </w:t>
+        <w:t xml:space="preserve">, keep that link and its working </w:t>
       </w:r>
       <w:r>
         <w:rPr>
@@ -1020,12 +1073,12 @@
         <w:t>htdocs</w:t>
       </w:r>
       <w:r>
-        <w:t>. The manual SQL route is intended for a straightforward phpMyAdmin demonstration. A public service should use a least-privilege database account rather than the manual template's default root connection.</w:t>
+        <w:t>.</w:t>
       </w:r>
     </w:p>
     <w:p>
       <w:r>
-        <w:t xml:space="preserve">If a page reports a database problem, check that XAMPP MySQL is running, that port and password in </w:t>
+        <w:t xml:space="preserve">For a database connection error, check that MySQL is running, that all three SQL imports completed, and that any custom </w:t>
       </w:r>
       <w:r>
         <w:rPr>
@@ -1035,7 +1088,17 @@
         <w:t>local.php</w:t>
       </w:r>
       <w:r>
-        <w:t xml:space="preserve"> match XAMPP, and that the three SQL imports finished in order. If the home page opens but the menu is empty, check the third import. If Apache uses a non-default port, include it in the browser URL. Stop Apache and MySQL in the Control Panel when the local demonstration is finished.</w:t>
+        <w:t xml:space="preserve"> password and port match XAMPP. For a 404 page, check the copied folder and URL. If the menu is empty, repeat the third SQL import. Add Apache's port after </w:t>
+      </w:r>
+      <w:r>
+        <w:rPr>
+          <w:rFonts w:ascii="Consolas" w:hAnsi="Consolas"/>
+          <w:sz w:val="18"/>
+        </w:rPr>
+        <w:t>localhost</w:t>
+      </w:r>
+      <w:r>
+        <w:t xml:space="preserve"> when it differs from port 80. Stop Apache and MySQL in the Control Panel when the local demonstration is finished.</w:t>
       </w:r>
     </w:p>
     <w:p>

</xml_diff>

<commit_message>
Add one-file XAMPP demo data and documented test accounts
</commit_message>
<xml_diff>
--- a/docs/word/Implementation-and-Management-2026.docx
+++ b/docs/word/Implementation-and-Management-2026.docx
@@ -35,7 +35,7 @@
         <w:t>public/index.php</w:t>
       </w:r>
       <w:r>
-        <w:t xml:space="preserve">; PHP renders pages and validates every state-changing request. The local XAMPP installation can use three ordered phpMyAdmin SQL files or </w:t>
+        <w:t xml:space="preserve">; PHP renders pages and validates every state-changing request. The local XAMPP installation uses one complete phpMyAdmin SQL file or </w:t>
       </w:r>
       <w:r>
         <w:rPr>
@@ -858,30 +858,10 @@
           <w:rFonts w:ascii="Consolas" w:hAnsi="Consolas"/>
           <w:sz w:val="18"/>
         </w:rPr>
-        <w:t>database/xampp/01-create-database.sql</w:t>
+        <w:t>database/xampp/cafe-portal-complete.sql</w:t>
       </w:r>
       <w:r>
-        <w:t xml:space="preserve"> and click Import. Repeat for </w:t>
-      </w:r>
-      <w:r>
-        <w:rPr>
-          <w:rFonts w:ascii="Consolas" w:hAnsi="Consolas"/>
-          <w:sz w:val="18"/>
-        </w:rPr>
-        <w:t>02-create-tables.sql</w:t>
-      </w:r>
-      <w:r>
-        <w:t xml:space="preserve"> and </w:t>
-      </w:r>
-      <w:r>
-        <w:rPr>
-          <w:rFonts w:ascii="Consolas" w:hAnsi="Consolas"/>
-          <w:sz w:val="18"/>
-        </w:rPr>
-        <w:t>03-demo-data.sql</w:t>
-      </w:r>
-      <w:r>
-        <w:t>, in order. The third file adds 12 menu products and the demo staff account; re-importing does not delete orders.</w:t>
+        <w:t xml:space="preserve"> and click Import. This single file creates the database, eight tables, 12 products, three test accounts and three example orders. Re-importing does not delete orders.</w:t>
       </w:r>
     </w:p>
     <w:p>
@@ -903,27 +883,7 @@
         <w:t>http://localhost/cafe/public/</w:t>
       </w:r>
       <w:r>
-        <w:t xml:space="preserve">. Check the menu, register a customer, then sign in to the Staff desk using </w:t>
-      </w:r>
-      <w:r>
-        <w:rPr>
-          <w:rFonts w:ascii="Consolas" w:hAnsi="Consolas"/>
-          <w:sz w:val="18"/>
-        </w:rPr>
-        <w:t>staff@example.test</w:t>
-      </w:r>
-      <w:r>
-        <w:t xml:space="preserve"> and password </w:t>
-      </w:r>
-      <w:r>
-        <w:rPr>
-          <w:rFonts w:ascii="Consolas" w:hAnsi="Consolas"/>
-          <w:sz w:val="18"/>
-        </w:rPr>
-        <w:t>1234567890</w:t>
-      </w:r>
-      <w:r>
-        <w:t xml:space="preserve">. Check that browser requests to </w:t>
+        <w:t xml:space="preserve">. Check the menu and sign in using the test accounts listed in README. Check that browser requests to </w:t>
       </w:r>
       <w:r>
         <w:rPr>
@@ -1053,7 +1013,7 @@
         <w:t>http://localhost/cafe/</w:t>
       </w:r>
       <w:r>
-        <w:t xml:space="preserve">. The command remains an alternative for a fresh installation: it creates a database-scoped account, imports the schema and menu, writes local settings and links only </w:t>
+        <w:t xml:space="preserve">. The command remains an alternative for a fresh installation: it creates a database-scoped account, imports the schema, menu and test accounts, writes local settings and links only </w:t>
       </w:r>
       <w:r>
         <w:rPr>
@@ -1078,7 +1038,7 @@
     </w:p>
     <w:p>
       <w:r>
-        <w:t xml:space="preserve">For a database connection error, check that MySQL is running, that all three SQL imports completed, and that any custom </w:t>
+        <w:t xml:space="preserve">For a database connection error, check that MySQL is running, that the complete SQL import finished, and that any custom </w:t>
       </w:r>
       <w:r>
         <w:rPr>
@@ -1088,7 +1048,7 @@
         <w:t>local.php</w:t>
       </w:r>
       <w:r>
-        <w:t xml:space="preserve"> password and port match XAMPP. For a 404 page, check the copied folder and URL. If the menu is empty, repeat the third SQL import. Add Apache's port after </w:t>
+        <w:t xml:space="preserve"> password and port match XAMPP. For a 404 page, check the copied folder and URL. If the menu is empty, repeat the complete SQL import. Add Apache's port after </w:t>
       </w:r>
       <w:r>
         <w:rPr>
@@ -3422,7 +3382,7 @@
     </w:p>
     <w:p>
       <w:r>
-        <w:t xml:space="preserve">The Part B handover consists of all source folders, the three ordered XAMPP SQL files, the three Word documents, and the test evidence under </w:t>
+        <w:t xml:space="preserve">The Part B handover consists of all source folders, the complete XAMPP SQL file, the three Word documents, and the test evidence under </w:t>
       </w:r>
       <w:r>
         <w:rPr>

</xml_diff>